<commit_message>
feat: Add comprehensive resources for problem-solving methodologies, quality tools, and related documentation.
</commit_message>
<xml_diff>
--- a/OI/Jeu du Kaizen/PRÉSENTATION DU JEU DU KAIZEN.docx
+++ b/OI/Jeu du Kaizen/PRÉSENTATION DU JEU DU KAIZEN.docx
@@ -782,11 +782,35 @@
           <w:bCs/>
         </w:rPr>
       </w:pPr>
-      <w:r>
-        <w:rPr>
-          <w:b/>
-          <w:bCs/>
-        </w:rPr>
+    </w:p>
+    <w:p>
+      <w:pPr>
+        <w:rPr>
+          <w:b/>
+          <w:bCs/>
+        </w:rPr>
+      </w:pPr>
+      <w:r>
+        <w:rPr>
+          <w:b/>
+          <w:bCs/>
+        </w:rPr>
+        <w:br w:type="page"/>
+      </w:r>
+    </w:p>
+    <w:p>
+      <w:pPr>
+        <w:rPr>
+          <w:b/>
+          <w:bCs/>
+        </w:rPr>
+      </w:pPr>
+      <w:r>
+        <w:rPr>
+          <w:b/>
+          <w:bCs/>
+        </w:rPr>
+        <w:lastRenderedPageBreak/>
         <w:t>III. Les Conditions de Réussite du Kaizen (Module 2)</w:t>
       </w:r>
     </w:p>
@@ -850,7 +874,6 @@
         </w:numPr>
       </w:pPr>
       <w:r>
-        <w:lastRenderedPageBreak/>
         <w:t xml:space="preserve">La Direction doit s'engager concrètement, par exemple en </w:t>
       </w:r>
       <w:r>
@@ -1100,15 +1123,7 @@
         </w:numPr>
       </w:pPr>
       <w:r>
-        <w:t xml:space="preserve">Le Kaizen n'est pas limité aux </w:t>
-      </w:r>
-      <w:proofErr w:type="spellStart"/>
-      <w:r>
-        <w:t>GAMs</w:t>
-      </w:r>
-      <w:proofErr w:type="spellEnd"/>
-      <w:r>
-        <w:t xml:space="preserve">. Le jeu présente d'autres modalités qui sont souvent complémentaires : </w:t>
+        <w:t xml:space="preserve">Le Kaizen n'est pas limité aux GAMs. Le jeu présente d'autres modalités qui sont souvent complémentaires : </w:t>
       </w:r>
     </w:p>
     <w:p>
@@ -1141,6 +1156,7 @@
           <w:b/>
           <w:bCs/>
         </w:rPr>
+        <w:lastRenderedPageBreak/>
         <w:t>CEDAC</w:t>
       </w:r>
       <w:r>
@@ -2052,6 +2068,7 @@
   <w:style w:type="character" w:default="1" w:styleId="Policepardfaut">
     <w:name w:val="Default Paragraph Font"/>
     <w:uiPriority w:val="1"/>
+    <w:semiHidden/>
     <w:unhideWhenUsed/>
   </w:style>
   <w:style w:type="table" w:default="1" w:styleId="TableauNormal">

</xml_diff>